<commit_message>
Update AquiferOpenBibleDictionary data for 2026-07-06 release
</commit_message>
<xml_diff>
--- a/por/docx/009.content.docx
+++ b/por/docx/009.content.docx
@@ -41316,6 +41316,157 @@
           <w:lang w:val="pt_PT" w:bidi="pt_PT"/>
         </w:rPr>
         <w:t>História de José, o carpinteiro</w:t>
+      </w:r>
+      <w:r>
+        <w:rPr>
+          <w:lang w:val="pt_PT" w:bidi="pt_PT"/>
+        </w:rPr>
+        <w:t xml:space="preserve">; </w:t>
+      </w:r>
+      <w:r>
+        <w:rPr>
+          <w:lang w:val="pt_PT" w:bidi="pt_PT"/>
+        </w:rPr>
+        <w:t>José</w:t>
+      </w:r>
+      <w:r>
+        <w:rPr>
+          <w:lang w:val="pt_PT" w:bidi="pt_PT"/>
+        </w:rPr>
+        <w:t>.</w:t>
+      </w:r>
+      <w:r>
+        <w:rPr>
+          <w:lang w:val="pt_PT" w:bidi="pt_PT"/>
+        </w:rPr>
+      </w:r>
+      <w:r>
+        <w:rPr>
+          <w:lang w:val="pt_PT" w:bidi="pt_PT"/>
+        </w:rPr>
+      </w:r>
+    </w:p>
+    <w:p>
+      <w:pPr/>
+      <w:r>
+        <w:rPr>
+          <w:lang w:val="pt_PT" w:bidi="pt_PT"/>
+        </w:rPr>
+      </w:r>
+    </w:p>
+    <w:p>
+      <w:pPr>
+        <w:pStyle w:val="Heading2"/>
+      </w:pPr>
+      <w:r>
+        <w:rPr>
+          <w:lang w:val="pt_PT" w:bidi="pt_PT"/>
+        </w:rPr>
+        <w:t>História de José, o carpinteiro</w:t>
+      </w:r>
+      <w:r>
+        <w:rPr>
+          <w:lang w:val="pt_PT" w:bidi="pt_PT"/>
+        </w:rPr>
+      </w:r>
+    </w:p>
+    <w:p>
+      <w:pPr/>
+      <w:r>
+        <w:rPr>
+          <w:lang w:val="pt_PT" w:bidi="pt_PT"/>
+        </w:rPr>
+      </w:r>
+      <w:r>
+        <w:rPr>
+          <w:lang w:val="pt_PT" w:bidi="pt_PT"/>
+        </w:rPr>
+        <w:t>Este antigo documento homenageia o pai terreno de Jesus e incentiva o respeito e a veneração de José. A história pode ter sido escrita por volta do século IV d.C., com base em declarações encontradas no capítulo 18. Nesse capítulo, Jesus diz a Maria: "Você também deve esperar o mesmo fim de vida que outros mortais". No século V d.C., muitas pessoas acreditavam na "Assunção da Virgem Maria".</w:t>
+      </w:r>
+    </w:p>
+    <w:p>
+      <w:pPr/>
+      <w:r>
+        <w:rPr>
+          <w:lang w:val="pt_PT" w:bidi="pt_PT"/>
+        </w:rPr>
+      </w:r>
+      <w:r>
+        <w:rPr>
+          <w:lang w:val="pt_PT" w:bidi="pt_PT"/>
+        </w:rPr>
+        <w:t>A história de José, o Carpinteiro, está relacionada a outro texto cristão primitivo, o Protoevangelho de Tiago. Foi influenciada pelo gnosticismo e por crenças religiosas egípcias. Cópias completas sobreviveram em copta e árabe, assim como fragmentos em saídico.</w:t>
+      </w:r>
+    </w:p>
+    <w:p>
+      <w:pPr/>
+      <w:r>
+        <w:rPr>
+          <w:lang w:val="pt_PT" w:bidi="pt_PT"/>
+        </w:rPr>
+      </w:r>
+      <w:r>
+        <w:rPr>
+          <w:lang w:val="pt_PT" w:bidi="pt_PT"/>
+        </w:rPr>
+        <w:t>A História de José, o Carpinteiro, afirma narrar a vida de José e sua morte pacífica aos 111 anos. Nessa história, Jesus a relata aos seus discípulos no Monte das Oliveiras. José é um carpinteiro (</w:t>
+      </w:r>
+      <w:hyperlink r:id="rId809">
+        <w:r>
+          <w:rPr>
+            <w:lang w:val="pt_PT" w:bidi="pt_PT"/>
+          </w:rPr>
+          <w:rPr>
+            <w:color w:val="0000EE"/>
+            <w:u w:val="single"/>
+          </w:rPr>
+          <w:t>Mt 13.55</w:t>
+        </w:r>
+      </w:hyperlink>
+      <w:r>
+        <w:rPr>
+          <w:lang w:val="pt_PT" w:bidi="pt_PT"/>
+        </w:rPr>
+        <w:t>) e um viúvo idoso quando se casa com Maria, de 12 anos. Ele tinha seis filhos de um casamento anterior. Após sua morte, Jesus faz um elogio fúnebre em seu funeral. O enterro segue costumes semelhantes às cerimônias egípcias para o deus Osíris.</w:t>
+      </w:r>
+    </w:p>
+    <w:p>
+      <w:pPr/>
+      <w:r>
+        <w:rPr>
+          <w:lang w:val="pt_PT" w:bidi="pt_PT"/>
+        </w:rPr>
+      </w:r>
+      <w:r>
+        <w:rPr>
+          <w:i/>
+          <w:lang w:val="pt_PT" w:bidi="pt_PT"/>
+        </w:rPr>
+        <w:t>Veja também</w:t>
+      </w:r>
+      <w:r>
+        <w:rPr>
+          <w:lang w:val="pt_PT" w:bidi="pt_PT"/>
+        </w:rPr>
+        <w:t xml:space="preserve"> </w:t>
+      </w:r>
+      <w:r>
+        <w:rPr>
+          <w:lang w:val="pt_PT" w:bidi="pt_PT"/>
+        </w:rPr>
+        <w:t>Apócrifos</w:t>
+      </w:r>
+      <w:r>
+        <w:rPr>
+          <w:lang w:val="pt_PT" w:bidi="pt_PT"/>
+        </w:rPr>
+        <w:t xml:space="preserve">; </w:t>
+      </w:r>
+      <w:r>
+        <w:rPr>
+          <w:lang w:val="pt_PT" w:bidi="pt_PT"/>
+        </w:rPr>
+        <w:t>História Árabe de José, o Carpinteiro</w:t>
       </w:r>
       <w:r>
         <w:rPr>

</xml_diff>